<commit_message>
Actualiza documentos de evidencia
</commit_message>
<xml_diff>
--- a/Fase 2/Evidencias Proyecto/Evidencias de documentación/Documento de Visión y Roles Scrum - SmartExpense AI.docx
+++ b/Fase 2/Evidencias Proyecto/Evidencias de documentación/Documento de Visión y Roles Scrum - SmartExpense AI.docx
@@ -716,7 +716,21 @@
           <w:rFonts w:ascii="Arial" w:cs="Arial" w:eastAsia="Arial" w:hAnsi="Arial"/>
           <w:rtl w:val="0"/>
         </w:rPr>
-        <w:t xml:space="preserve"> SmartExpense AI: Plataforma de Digitalización, Reconstrucción de Boletas y Gestión Contable mediante Machine Learning y Arquitectura Híbrida (On-Premise / Cloud)</w:t>
+        <w:t xml:space="preserve"> </w:t>
+      </w:r>
+      <w:r>
+        <w:rPr>
+          <w:rFonts w:ascii="Arial" w:cs="Arial" w:eastAsia="Arial" w:hAnsi="Arial"/>
+          <w:rtl w:val="0"/>
+        </w:rPr>
+        <w:t xml:space="preserve">SmartExpense</w:t>
+      </w:r>
+      <w:r>
+        <w:rPr>
+          <w:rFonts w:ascii="Arial" w:cs="Arial" w:eastAsia="Arial" w:hAnsi="Arial"/>
+          <w:rtl w:val="0"/>
+        </w:rPr>
+        <w:t xml:space="preserve"> AI: Plataforma de Digitalización, Reconstrucción de Boletas y Gestión Contable mediante Machine Learning y Arquitectura Híbrida (On-Premise / Cloud)</w:t>
       </w:r>
     </w:p>
     <w:p>
@@ -1758,7 +1772,14 @@
                 <w:rFonts w:ascii="Arial" w:cs="Arial" w:eastAsia="Arial" w:hAnsi="Arial"/>
                 <w:rtl w:val="0"/>
               </w:rPr>
-              <w:t xml:space="preserve">SmartExpense AI: Plataforma de Digitalización, Reconstrucción de Boletas y Gestión Contable mediante Machine Learning y Arquitectura Híbrida</w:t>
+              <w:t xml:space="preserve">SmartExpense</w:t>
+            </w:r>
+            <w:r>
+              <w:rPr>
+                <w:rFonts w:ascii="Arial" w:cs="Arial" w:eastAsia="Arial" w:hAnsi="Arial"/>
+                <w:rtl w:val="0"/>
+              </w:rPr>
+              <w:t xml:space="preserve"> AI: Plataforma de Digitalización, Reconstrucción de Boletas y Gestión Contable mediante Machine Learning y Arquitectura Híbrida</w:t>
             </w:r>
           </w:p>
         </w:tc>
@@ -2572,10 +2593,14 @@
             </w:pPr>
             <w:r>
               <w:rPr>
-                <w:rFonts w:ascii="Arial" w:cs="Arial" w:eastAsia="Arial" w:hAnsi="Arial"/>
-                <w:rtl w:val="0"/>
-              </w:rPr>
-              <w:t xml:space="preserve">Por definir</w:t>
+                <w:rtl w:val="0"/>
+              </w:rPr>
+              <w:t xml:space="preserve">21.611.721-2</w:t>
+            </w:r>
+            <w:r>
+              <w:rPr>
+                <w:rtl w:val="0"/>
+              </w:rPr>
             </w:r>
           </w:p>
         </w:tc>
@@ -2687,7 +2712,23 @@
           <w:color w:val="2b6cb0"/>
           <w:rtl w:val="0"/>
         </w:rPr>
-        <w:t xml:space="preserve">2. Visión del Proyecto Scrum "SmartExpense AI"</w:t>
+        <w:t xml:space="preserve">2. Visión del Proyecto Scrum "</w:t>
+      </w:r>
+      <w:r>
+        <w:rPr>
+          <w:rFonts w:ascii="Arial" w:cs="Arial" w:eastAsia="Arial" w:hAnsi="Arial"/>
+          <w:color w:val="2b6cb0"/>
+          <w:rtl w:val="0"/>
+        </w:rPr>
+        <w:t xml:space="preserve">SmartExpense</w:t>
+      </w:r>
+      <w:r>
+        <w:rPr>
+          <w:rFonts w:ascii="Arial" w:cs="Arial" w:eastAsia="Arial" w:hAnsi="Arial"/>
+          <w:color w:val="2b6cb0"/>
+          <w:rtl w:val="0"/>
+        </w:rPr>
+        <w:t xml:space="preserve"> AI"</w:t>
       </w:r>
     </w:p>
     <w:p>
@@ -2772,7 +2813,17 @@
           <w:shd w:fill="f1f5f9" w:val="clear"/>
           <w:rtl w:val="0"/>
         </w:rPr>
-        <w:t xml:space="preserve">SmartExpense AI</w:t>
+        <w:t xml:space="preserve">SmartExpense</w:t>
+      </w:r>
+      <w:r>
+        <w:rPr>
+          <w:rFonts w:ascii="Arial" w:cs="Arial" w:eastAsia="Arial" w:hAnsi="Arial"/>
+          <w:b w:val="1"/>
+          <w:bCs w:val="1"/>
+          <w:shd w:fill="f1f5f9" w:val="clear"/>
+          <w:rtl w:val="0"/>
+        </w:rPr>
+        <w:t xml:space="preserve"> AI</w:t>
       </w:r>
       <w:r>
         <w:rPr>
@@ -4591,7 +4642,21 @@
                 <w:shd w:fill="auto" w:val="clear"/>
                 <w:rtl w:val="0"/>
               </w:rPr>
-              <w:t xml:space="preserve">(RUT: Por definir)</w:t>
+              <w:t xml:space="preserve">(RUT: </w:t>
+            </w:r>
+            <w:r>
+              <w:rPr>
+                <w:rtl w:val="0"/>
+              </w:rPr>
+              <w:t xml:space="preserve">21.611.721-2</w:t>
+            </w:r>
+            <w:r>
+              <w:rPr>
+                <w:rFonts w:ascii="Arial" w:cs="Arial" w:eastAsia="Arial" w:hAnsi="Arial"/>
+                <w:shd w:fill="auto" w:val="clear"/>
+                <w:rtl w:val="0"/>
+              </w:rPr>
+              <w:t xml:space="preserve">)</w:t>
             </w:r>
           </w:p>
         </w:tc>

</xml_diff>